<commit_message>
Finalizing CI/CD configue and docker-setup, freeze all the document all go to implement phase
</commit_message>
<xml_diff>
--- a/Docs/ProposalMessenGO.docx
+++ b/Docs/ProposalMessenGO.docx
@@ -394,12 +394,12 @@
           <wp:inline distB="114300" distT="114300" distL="114300" distR="114300">
             <wp:extent cx="3687753" cy="8348663"/>
             <wp:effectExtent b="0" l="0" r="0" t="0"/>
-            <wp:docPr id="2" name="image7.png"/>
+            <wp:docPr id="3" name="image10.png"/>
             <a:graphic>
               <a:graphicData uri="http://schemas.openxmlformats.org/drawingml/2006/picture">
                 <pic:pic>
                   <pic:nvPicPr>
-                    <pic:cNvPr id="0" name="image7.png"/>
+                    <pic:cNvPr id="0" name="image10.png"/>
                     <pic:cNvPicPr preferRelativeResize="0"/>
                   </pic:nvPicPr>
                   <pic:blipFill>
@@ -460,12 +460,12 @@
           <wp:inline distB="114300" distT="114300" distL="114300" distR="114300">
             <wp:extent cx="5731200" cy="2819400"/>
             <wp:effectExtent b="0" l="0" r="0" t="0"/>
-            <wp:docPr id="6" name="image8.png"/>
+            <wp:docPr id="19" name="image5.png"/>
             <a:graphic>
               <a:graphicData uri="http://schemas.openxmlformats.org/drawingml/2006/picture">
                 <pic:pic>
                   <pic:nvPicPr>
-                    <pic:cNvPr id="0" name="image8.png"/>
+                    <pic:cNvPr id="0" name="image5.png"/>
                     <pic:cNvPicPr preferRelativeResize="0"/>
                   </pic:nvPicPr>
                   <pic:blipFill>
@@ -526,12 +526,12 @@
           <wp:inline distB="114300" distT="114300" distL="114300" distR="114300">
             <wp:extent cx="5731200" cy="7023100"/>
             <wp:effectExtent b="0" l="0" r="0" t="0"/>
-            <wp:docPr id="9" name="image5.png"/>
+            <wp:docPr id="16" name="image4.png"/>
             <a:graphic>
               <a:graphicData uri="http://schemas.openxmlformats.org/drawingml/2006/picture">
                 <pic:pic>
                   <pic:nvPicPr>
-                    <pic:cNvPr id="0" name="image5.png"/>
+                    <pic:cNvPr id="0" name="image4.png"/>
                     <pic:cNvPicPr preferRelativeResize="0"/>
                   </pic:nvPicPr>
                   <pic:blipFill>
@@ -672,7 +672,7 @@
           <wp:inline distB="114300" distT="114300" distL="114300" distR="114300">
             <wp:extent cx="3529013" cy="4907853"/>
             <wp:effectExtent b="0" l="0" r="0" t="0"/>
-            <wp:docPr id="7" name="image6.png"/>
+            <wp:docPr id="8" name="image6.png"/>
             <a:graphic>
               <a:graphicData uri="http://schemas.openxmlformats.org/drawingml/2006/picture">
                 <pic:pic>
@@ -784,12 +784,12 @@
           <wp:inline distB="114300" distT="114300" distL="114300" distR="114300">
             <wp:extent cx="4310063" cy="2656201"/>
             <wp:effectExtent b="0" l="0" r="0" t="0"/>
-            <wp:docPr id="3" name="image1.png"/>
+            <wp:docPr id="15" name="image8.png"/>
             <a:graphic>
               <a:graphicData uri="http://schemas.openxmlformats.org/drawingml/2006/picture">
                 <pic:pic>
                   <pic:nvPicPr>
-                    <pic:cNvPr id="0" name="image1.png"/>
+                    <pic:cNvPr id="0" name="image8.png"/>
                     <pic:cNvPicPr preferRelativeResize="0"/>
                   </pic:nvPicPr>
                   <pic:blipFill>
@@ -840,12 +840,12 @@
           <wp:inline distB="114300" distT="114300" distL="114300" distR="114300">
             <wp:extent cx="4252913" cy="3988813"/>
             <wp:effectExtent b="0" l="0" r="0" t="0"/>
-            <wp:docPr id="5" name="image15.png"/>
+            <wp:docPr id="13" name="image13.png"/>
             <a:graphic>
               <a:graphicData uri="http://schemas.openxmlformats.org/drawingml/2006/picture">
                 <pic:pic>
                   <pic:nvPicPr>
-                    <pic:cNvPr id="0" name="image15.png"/>
+                    <pic:cNvPr id="0" name="image13.png"/>
                     <pic:cNvPicPr preferRelativeResize="0"/>
                   </pic:nvPicPr>
                   <pic:blipFill>
@@ -986,12 +986,12 @@
           <wp:inline distB="114300" distT="114300" distL="114300" distR="114300">
             <wp:extent cx="3789532" cy="2839450"/>
             <wp:effectExtent b="0" l="0" r="0" t="0"/>
-            <wp:docPr id="1" name="image9.png"/>
+            <wp:docPr id="22" name="image3.png"/>
             <a:graphic>
               <a:graphicData uri="http://schemas.openxmlformats.org/drawingml/2006/picture">
                 <pic:pic>
                   <pic:nvPicPr>
-                    <pic:cNvPr id="0" name="image9.png"/>
+                    <pic:cNvPr id="0" name="image3.png"/>
                     <pic:cNvPicPr preferRelativeResize="0"/>
                   </pic:nvPicPr>
                   <pic:blipFill>
@@ -2496,12 +2496,12 @@
           <wp:inline distB="114300" distT="114300" distL="114300" distR="114300">
             <wp:extent cx="5731200" cy="5194300"/>
             <wp:effectExtent b="0" l="0" r="0" t="0"/>
-            <wp:docPr id="10" name="image4.png"/>
+            <wp:docPr id="9" name="image7.png"/>
             <a:graphic>
               <a:graphicData uri="http://schemas.openxmlformats.org/drawingml/2006/picture">
                 <pic:pic>
                   <pic:nvPicPr>
-                    <pic:cNvPr id="0" name="image4.png"/>
+                    <pic:cNvPr id="0" name="image7.png"/>
                     <pic:cNvPicPr preferRelativeResize="0"/>
                   </pic:nvPicPr>
                   <pic:blipFill>
@@ -13122,12 +13122,12 @@
           <wp:inline distB="114300" distT="114300" distL="114300" distR="114300">
             <wp:extent cx="6491288" cy="4838700"/>
             <wp:effectExtent b="0" l="0" r="0" t="0"/>
-            <wp:docPr id="12" name="image14.png"/>
+            <wp:docPr id="2" name="image16.png"/>
             <a:graphic>
               <a:graphicData uri="http://schemas.openxmlformats.org/drawingml/2006/picture">
                 <pic:pic>
                   <pic:nvPicPr>
-                    <pic:cNvPr id="0" name="image14.png"/>
+                    <pic:cNvPr id="0" name="image16.png"/>
                     <pic:cNvPicPr preferRelativeResize="0"/>
                   </pic:nvPicPr>
                   <pic:blipFill>
@@ -38126,12 +38126,12 @@
           <wp:inline distB="114300" distT="114300" distL="114300" distR="114300">
             <wp:extent cx="5876925" cy="4767263"/>
             <wp:effectExtent b="0" l="0" r="0" t="0"/>
-            <wp:docPr id="8" name="image3.png"/>
+            <wp:docPr id="21" name="image14.png"/>
             <a:graphic>
               <a:graphicData uri="http://schemas.openxmlformats.org/drawingml/2006/picture">
                 <pic:pic>
                   <pic:nvPicPr>
-                    <pic:cNvPr id="0" name="image3.png"/>
+                    <pic:cNvPr id="0" name="image14.png"/>
                     <pic:cNvPicPr preferRelativeResize="0"/>
                   </pic:nvPicPr>
                   <pic:blipFill>
@@ -38176,12 +38176,12 @@
           <wp:inline distB="114300" distT="114300" distL="114300" distR="114300">
             <wp:extent cx="5734050" cy="4291013"/>
             <wp:effectExtent b="0" l="0" r="0" t="0"/>
-            <wp:docPr id="16" name="image17.png"/>
+            <wp:docPr id="1" name="image1.png"/>
             <a:graphic>
               <a:graphicData uri="http://schemas.openxmlformats.org/drawingml/2006/picture">
                 <pic:pic>
                   <pic:nvPicPr>
-                    <pic:cNvPr id="0" name="image17.png"/>
+                    <pic:cNvPr id="0" name="image1.png"/>
                     <pic:cNvPicPr preferRelativeResize="0"/>
                   </pic:nvPicPr>
                   <pic:blipFill>
@@ -38226,12 +38226,12 @@
           <wp:inline distB="114300" distT="114300" distL="114300" distR="114300">
             <wp:extent cx="5734050" cy="4625551"/>
             <wp:effectExtent b="0" l="0" r="0" t="0"/>
-            <wp:docPr id="14" name="image13.png"/>
+            <wp:docPr id="18" name="image11.png"/>
             <a:graphic>
               <a:graphicData uri="http://schemas.openxmlformats.org/drawingml/2006/picture">
                 <pic:pic>
                   <pic:nvPicPr>
-                    <pic:cNvPr id="0" name="image13.png"/>
+                    <pic:cNvPr id="0" name="image11.png"/>
                     <pic:cNvPicPr preferRelativeResize="0"/>
                   </pic:nvPicPr>
                   <pic:blipFill>
@@ -38274,12 +38274,12 @@
           <wp:inline distB="114300" distT="114300" distL="114300" distR="114300">
             <wp:extent cx="5734050" cy="4039011"/>
             <wp:effectExtent b="0" l="0" r="0" t="0"/>
-            <wp:docPr id="4" name="image11.png"/>
+            <wp:docPr id="24" name="image20.png"/>
             <a:graphic>
               <a:graphicData uri="http://schemas.openxmlformats.org/drawingml/2006/picture">
                 <pic:pic>
                   <pic:nvPicPr>
-                    <pic:cNvPr id="0" name="image11.png"/>
+                    <pic:cNvPr id="0" name="image20.png"/>
                     <pic:cNvPicPr preferRelativeResize="0"/>
                   </pic:nvPicPr>
                   <pic:blipFill>
@@ -38339,12 +38339,12 @@
           <wp:inline distB="114300" distT="114300" distL="114300" distR="114300">
             <wp:extent cx="5731200" cy="4749800"/>
             <wp:effectExtent b="0" l="0" r="0" t="0"/>
-            <wp:docPr id="17" name="image12.png"/>
+            <wp:docPr id="20" name="image17.png"/>
             <a:graphic>
               <a:graphicData uri="http://schemas.openxmlformats.org/drawingml/2006/picture">
                 <pic:pic>
                   <pic:nvPicPr>
-                    <pic:cNvPr id="0" name="image12.png"/>
+                    <pic:cNvPr id="0" name="image17.png"/>
                     <pic:cNvPicPr preferRelativeResize="0"/>
                   </pic:nvPicPr>
                   <pic:blipFill>
@@ -38404,12 +38404,12 @@
           <wp:inline distB="114300" distT="114300" distL="114300" distR="114300">
             <wp:extent cx="5734050" cy="4033838"/>
             <wp:effectExtent b="0" l="0" r="0" t="0"/>
-            <wp:docPr id="13" name="image16.png"/>
+            <wp:docPr id="7" name="image23.png"/>
             <a:graphic>
               <a:graphicData uri="http://schemas.openxmlformats.org/drawingml/2006/picture">
                 <pic:pic>
                   <pic:nvPicPr>
-                    <pic:cNvPr id="0" name="image16.png"/>
+                    <pic:cNvPr id="0" name="image23.png"/>
                     <pic:cNvPicPr preferRelativeResize="0"/>
                   </pic:nvPicPr>
                   <pic:blipFill>
@@ -38479,10 +38479,2268 @@
     </w:p>
     <w:p>
       <w:pPr>
+        <w:pStyle w:val="Heading2"/>
+        <w:keepNext w:val="0"/>
+        <w:keepLines w:val="0"/>
+        <w:spacing w:after="80" w:lineRule="auto"/>
+        <w:rPr>
+          <w:b w:val="1"/>
+          <w:bCs w:val="1"/>
+          <w:sz w:val="34"/>
+          <w:szCs w:val="34"/>
+        </w:rPr>
+      </w:pPr>
+      <w:bookmarkStart w:colFirst="0" w:colLast="0" w:name="_1q09hpbs7bdk" w:id="67"/>
+      <w:bookmarkEnd w:id="67"/>
+      <w:r>
+        <w:rPr>
+          <w:b w:val="1"/>
+          <w:bCs w:val="1"/>
+          <w:sz w:val="34"/>
+          <w:szCs w:val="34"/>
+          <w:rtl w:val="0"/>
+        </w:rPr>
+        <w:t xml:space="preserve">1. Traceability &amp; Mapping Matrix</w:t>
+      </w:r>
+    </w:p>
+    <w:tbl>
+      <w:tblPr>
+        <w:tblStyle w:val="Table21"/>
+        <w:tblW w:w="9025.511811023624" w:type="dxa"/>
+        <w:jc w:val="left"/>
+        <w:tblLayout w:type="fixed"/>
+        <w:tblLook w:val="0600"/>
+      </w:tblPr>
+      <w:tblGrid>
+        <w:gridCol w:w="1069.9635872036179"/>
+        <w:gridCol w:w="2412.0299832219494"/>
+        <w:gridCol w:w="1554.2143486535313"/>
+        <w:gridCol w:w="3989.303891944524"/>
+        <w:tblGridChange w:id="0">
+          <w:tblGrid>
+            <w:gridCol w:w="1069.9635872036179"/>
+            <w:gridCol w:w="2412.0299832219494"/>
+            <w:gridCol w:w="1554.2143486535313"/>
+            <w:gridCol w:w="3989.303891944524"/>
+          </w:tblGrid>
+        </w:tblGridChange>
+      </w:tblGrid>
+      <w:tr>
+        <w:trPr>
+          <w:cantSplit w:val="0"/>
+          <w:trHeight w:val="1340" w:hRule="atLeast"/>
+          <w:tblHeader w:val="0"/>
+        </w:trPr>
+        <w:tc>
+          <w:tcPr/>
+          <w:p>
+            <w:pPr>
+              <w:rPr/>
+            </w:pPr>
+            <w:r>
+              <w:rPr>
+                <w:b w:val="1"/>
+                <w:bCs w:val="1"/>
+                <w:rtl w:val="0"/>
+              </w:rPr>
+              <w:t xml:space="preserve">Diagram #</w:t>
+            </w:r>
+            <w:r>
+              <w:rPr>
+                <w:rtl w:val="0"/>
+              </w:rPr>
+            </w:r>
+          </w:p>
+        </w:tc>
+        <w:tc>
+          <w:tcPr/>
+          <w:p>
+            <w:pPr>
+              <w:rPr/>
+            </w:pPr>
+            <w:r>
+              <w:rPr>
+                <w:b w:val="1"/>
+                <w:bCs w:val="1"/>
+                <w:rtl w:val="0"/>
+              </w:rPr>
+              <w:t xml:space="preserve">Workflow / Scope</w:t>
+            </w:r>
+            <w:r>
+              <w:rPr>
+                <w:rtl w:val="0"/>
+              </w:rPr>
+            </w:r>
+          </w:p>
+        </w:tc>
+        <w:tc>
+          <w:tcPr/>
+          <w:p>
+            <w:pPr>
+              <w:rPr/>
+            </w:pPr>
+            <w:r>
+              <w:rPr>
+                <w:b w:val="1"/>
+                <w:bCs w:val="1"/>
+                <w:rtl w:val="0"/>
+              </w:rPr>
+              <w:t xml:space="preserve">Mapped Use Cases &amp; Sequence Diagrams</w:t>
+            </w:r>
+            <w:r>
+              <w:rPr>
+                <w:rtl w:val="0"/>
+              </w:rPr>
+            </w:r>
+          </w:p>
+        </w:tc>
+        <w:tc>
+          <w:tcPr/>
+          <w:p>
+            <w:pPr>
+              <w:rPr/>
+            </w:pPr>
+            <w:r>
+              <w:rPr>
+                <w:b w:val="1"/>
+                <w:bCs w:val="1"/>
+                <w:rtl w:val="0"/>
+              </w:rPr>
+              <w:t xml:space="preserve">Relevant DB Entities &amp; Architectural Constraints</w:t>
+            </w:r>
+            <w:r>
+              <w:rPr>
+                <w:rtl w:val="0"/>
+              </w:rPr>
+            </w:r>
+          </w:p>
+        </w:tc>
+      </w:tr>
+      <w:tr>
+        <w:trPr>
+          <w:cantSplit w:val="0"/>
+          <w:trHeight w:val="1055" w:hRule="atLeast"/>
+          <w:tblHeader w:val="0"/>
+        </w:trPr>
+        <w:tc>
+          <w:tcPr/>
+          <w:p>
+            <w:pPr>
+              <w:rPr/>
+            </w:pPr>
+            <w:r>
+              <w:rPr>
+                <w:b w:val="1"/>
+                <w:bCs w:val="1"/>
+                <w:rtl w:val="0"/>
+              </w:rPr>
+              <w:t xml:space="preserve">Diagram 1</w:t>
+            </w:r>
+            <w:r>
+              <w:rPr>
+                <w:rtl w:val="0"/>
+              </w:rPr>
+            </w:r>
+          </w:p>
+        </w:tc>
+        <w:tc>
+          <w:tcPr/>
+          <w:p>
+            <w:pPr>
+              <w:rPr/>
+            </w:pPr>
+            <w:r>
+              <w:rPr>
+                <w:b w:val="1"/>
+                <w:bCs w:val="1"/>
+                <w:rtl w:val="0"/>
+              </w:rPr>
+              <w:t xml:space="preserve">User Authentication &amp; Device Registration (OTP &amp; JWT)</w:t>
+            </w:r>
+            <w:r>
+              <w:rPr>
+                <w:rtl w:val="0"/>
+              </w:rPr>
+            </w:r>
+          </w:p>
+        </w:tc>
+        <w:tc>
+          <w:tcPr/>
+          <w:p>
+            <w:pPr>
+              <w:rPr/>
+            </w:pPr>
+            <w:r>
+              <w:rPr>
+                <w:rtl w:val="0"/>
+              </w:rPr>
+              <w:t xml:space="preserve">UC01, UC02, UC04, UC07 / </w:t>
+            </w:r>
+            <w:r>
+              <w:rPr>
+                <w:b w:val="1"/>
+                <w:bCs w:val="1"/>
+                <w:rtl w:val="0"/>
+              </w:rPr>
+              <w:t xml:space="preserve">Seq1</w:t>
+            </w:r>
+            <w:r>
+              <w:rPr>
+                <w:rtl w:val="0"/>
+              </w:rPr>
+            </w:r>
+          </w:p>
+        </w:tc>
+        <w:tc>
+          <w:tcPr/>
+          <w:p>
+            <w:pPr>
+              <w:rPr/>
+            </w:pPr>
+            <w:r>
+              <w:rPr>
+                <w:rtl w:val="0"/>
+              </w:rPr>
+              <w:t xml:space="preserve">Redis </w:t>
+            </w:r>
+            <w:r>
+              <w:rPr>
+                <w:rFonts w:ascii="Roboto Mono" w:cs="Roboto Mono" w:eastAsia="Roboto Mono" w:hAnsi="Roboto Mono"/>
+                <w:color w:val="188038"/>
+                <w:rtl w:val="0"/>
+              </w:rPr>
+              <w:t xml:space="preserve">otp:{phone}</w:t>
+            </w:r>
+            <w:r>
+              <w:rPr>
+                <w:rtl w:val="0"/>
+              </w:rPr>
+              <w:t xml:space="preserve"> (TTL 5m), </w:t>
+            </w:r>
+            <w:r>
+              <w:rPr>
+                <w:rFonts w:ascii="Roboto Mono" w:cs="Roboto Mono" w:eastAsia="Roboto Mono" w:hAnsi="Roboto Mono"/>
+                <w:color w:val="188038"/>
+                <w:rtl w:val="0"/>
+              </w:rPr>
+              <w:t xml:space="preserve">otp_try:{phone}</w:t>
+            </w:r>
+            <w:r>
+              <w:rPr>
+                <w:rtl w:val="0"/>
+              </w:rPr>
+              <w:t xml:space="preserve"> (TTL 15m); </w:t>
+            </w:r>
+            <w:r>
+              <w:rPr>
+                <w:rFonts w:ascii="Roboto Mono" w:cs="Roboto Mono" w:eastAsia="Roboto Mono" w:hAnsi="Roboto Mono"/>
+                <w:color w:val="188038"/>
+                <w:rtl w:val="0"/>
+              </w:rPr>
+              <w:t xml:space="preserve">Identity.User</w:t>
+            </w:r>
+            <w:r>
+              <w:rPr>
+                <w:rtl w:val="0"/>
+              </w:rPr>
+              <w:t xml:space="preserve">, </w:t>
+            </w:r>
+            <w:r>
+              <w:rPr>
+                <w:rFonts w:ascii="Roboto Mono" w:cs="Roboto Mono" w:eastAsia="Roboto Mono" w:hAnsi="Roboto Mono"/>
+                <w:color w:val="188038"/>
+                <w:rtl w:val="0"/>
+              </w:rPr>
+              <w:t xml:space="preserve">Identity.Device</w:t>
+            </w:r>
+            <w:r>
+              <w:rPr>
+                <w:rtl w:val="0"/>
+              </w:rPr>
+              <w:t xml:space="preserve">; </w:t>
+            </w:r>
+            <w:r>
+              <w:rPr>
+                <w:rFonts w:ascii="Roboto Mono" w:cs="Roboto Mono" w:eastAsia="Roboto Mono" w:hAnsi="Roboto Mono"/>
+                <w:color w:val="188038"/>
+                <w:rtl w:val="0"/>
+              </w:rPr>
+              <w:t xml:space="preserve">Auth.Refresh_Token</w:t>
+            </w:r>
+            <w:r>
+              <w:rPr>
+                <w:rtl w:val="0"/>
+              </w:rPr>
+              <w:t xml:space="preserve">.</w:t>
+            </w:r>
+          </w:p>
+        </w:tc>
+      </w:tr>
+      <w:tr>
+        <w:trPr>
+          <w:cantSplit w:val="0"/>
+          <w:trHeight w:val="1340" w:hRule="atLeast"/>
+          <w:tblHeader w:val="0"/>
+        </w:trPr>
+        <w:tc>
+          <w:tcPr/>
+          <w:p>
+            <w:pPr>
+              <w:rPr/>
+            </w:pPr>
+            <w:r>
+              <w:rPr>
+                <w:b w:val="1"/>
+                <w:bCs w:val="1"/>
+                <w:rtl w:val="0"/>
+              </w:rPr>
+              <w:t xml:space="preserve">Diagram 2</w:t>
+            </w:r>
+            <w:r>
+              <w:rPr>
+                <w:rtl w:val="0"/>
+              </w:rPr>
+            </w:r>
+          </w:p>
+        </w:tc>
+        <w:tc>
+          <w:tcPr/>
+          <w:p>
+            <w:pPr>
+              <w:rPr/>
+            </w:pPr>
+            <w:r>
+              <w:rPr>
+                <w:b w:val="1"/>
+                <w:bCs w:val="1"/>
+                <w:rtl w:val="0"/>
+              </w:rPr>
+              <w:t xml:space="preserve">Contact Discovery &amp; Friendship Management</w:t>
+            </w:r>
+            <w:r>
+              <w:rPr>
+                <w:rtl w:val="0"/>
+              </w:rPr>
+            </w:r>
+          </w:p>
+        </w:tc>
+        <w:tc>
+          <w:tcPr/>
+          <w:p>
+            <w:pPr>
+              <w:rPr/>
+            </w:pPr>
+            <w:r>
+              <w:rPr>
+                <w:rtl w:val="0"/>
+              </w:rPr>
+              <w:t xml:space="preserve">UC08, UC09, UC10 / </w:t>
+            </w:r>
+            <w:r>
+              <w:rPr>
+                <w:b w:val="1"/>
+                <w:bCs w:val="1"/>
+                <w:rtl w:val="0"/>
+              </w:rPr>
+              <w:t xml:space="preserve">Seq2</w:t>
+            </w:r>
+            <w:r>
+              <w:rPr>
+                <w:rtl w:val="0"/>
+              </w:rPr>
+            </w:r>
+          </w:p>
+        </w:tc>
+        <w:tc>
+          <w:tcPr/>
+          <w:p>
+            <w:pPr>
+              <w:rPr/>
+            </w:pPr>
+            <w:r>
+              <w:rPr>
+                <w:rFonts w:ascii="Roboto Mono" w:cs="Roboto Mono" w:eastAsia="Roboto Mono" w:hAnsi="Roboto Mono"/>
+                <w:color w:val="188038"/>
+                <w:rtl w:val="0"/>
+              </w:rPr>
+              <w:t xml:space="preserve">Identity.Contact</w:t>
+            </w:r>
+            <w:r>
+              <w:rPr>
+                <w:rtl w:val="0"/>
+              </w:rPr>
+              <w:t xml:space="preserve"> (</w:t>
+            </w:r>
+            <w:r>
+              <w:rPr>
+                <w:rFonts w:ascii="Roboto Mono" w:cs="Roboto Mono" w:eastAsia="Roboto Mono" w:hAnsi="Roboto Mono"/>
+                <w:color w:val="188038"/>
+                <w:rtl w:val="0"/>
+              </w:rPr>
+              <w:t xml:space="preserve">status: pending/accepted/blocked</w:t>
+            </w:r>
+            <w:r>
+              <w:rPr>
+                <w:rtl w:val="0"/>
+              </w:rPr>
+              <w:t xml:space="preserve">); Redis Streams event </w:t>
+            </w:r>
+            <w:r>
+              <w:rPr>
+                <w:rFonts w:ascii="Roboto Mono" w:cs="Roboto Mono" w:eastAsia="Roboto Mono" w:hAnsi="Roboto Mono"/>
+                <w:color w:val="188038"/>
+                <w:rtl w:val="0"/>
+              </w:rPr>
+              <w:t xml:space="preserve">contact.accepted</w:t>
+            </w:r>
+            <w:r>
+              <w:rPr>
+                <w:rtl w:val="0"/>
+              </w:rPr>
+              <w:t xml:space="preserve"> triggers </w:t>
+            </w:r>
+            <w:r>
+              <w:rPr>
+                <w:rFonts w:ascii="Roboto Mono" w:cs="Roboto Mono" w:eastAsia="Roboto Mono" w:hAnsi="Roboto Mono"/>
+                <w:color w:val="188038"/>
+                <w:rtl w:val="0"/>
+              </w:rPr>
+              <w:t xml:space="preserve">CONVERSATION</w:t>
+            </w:r>
+            <w:r>
+              <w:rPr>
+                <w:rtl w:val="0"/>
+              </w:rPr>
+              <w:t xml:space="preserve"> creation.</w:t>
+            </w:r>
+          </w:p>
+        </w:tc>
+      </w:tr>
+      <w:tr>
+        <w:trPr>
+          <w:cantSplit w:val="0"/>
+          <w:trHeight w:val="1610" w:hRule="atLeast"/>
+          <w:tblHeader w:val="0"/>
+        </w:trPr>
+        <w:tc>
+          <w:tcPr/>
+          <w:p>
+            <w:pPr>
+              <w:rPr/>
+            </w:pPr>
+            <w:r>
+              <w:rPr>
+                <w:b w:val="1"/>
+                <w:bCs w:val="1"/>
+                <w:rtl w:val="0"/>
+              </w:rPr>
+              <w:t xml:space="preserve">Diagram 3</w:t>
+            </w:r>
+            <w:r>
+              <w:rPr>
+                <w:rtl w:val="0"/>
+              </w:rPr>
+            </w:r>
+          </w:p>
+        </w:tc>
+        <w:tc>
+          <w:tcPr/>
+          <w:p>
+            <w:pPr>
+              <w:rPr/>
+            </w:pPr>
+            <w:r>
+              <w:rPr>
+                <w:b w:val="1"/>
+                <w:bCs w:val="1"/>
+                <w:rtl w:val="0"/>
+              </w:rPr>
+              <w:t xml:space="preserve">Core 1-1 Messaging &amp; Outbox Dispatcher</w:t>
+            </w:r>
+            <w:r>
+              <w:rPr>
+                <w:rtl w:val="0"/>
+              </w:rPr>
+            </w:r>
+          </w:p>
+        </w:tc>
+        <w:tc>
+          <w:tcPr/>
+          <w:p>
+            <w:pPr>
+              <w:rPr/>
+            </w:pPr>
+            <w:r>
+              <w:rPr>
+                <w:rtl w:val="0"/>
+              </w:rPr>
+              <w:t xml:space="preserve">UC11, UC13, UC14 / </w:t>
+            </w:r>
+            <w:r>
+              <w:rPr>
+                <w:b w:val="1"/>
+                <w:bCs w:val="1"/>
+                <w:rtl w:val="0"/>
+              </w:rPr>
+              <w:t xml:space="preserve">Seq3</w:t>
+            </w:r>
+            <w:r>
+              <w:rPr>
+                <w:rtl w:val="0"/>
+              </w:rPr>
+            </w:r>
+          </w:p>
+        </w:tc>
+        <w:tc>
+          <w:tcPr/>
+          <w:p>
+            <w:pPr>
+              <w:rPr/>
+            </w:pPr>
+            <w:r>
+              <w:rPr>
+                <w:b w:val="1"/>
+                <w:bCs w:val="1"/>
+                <w:rtl w:val="0"/>
+              </w:rPr>
+              <w:t xml:space="preserve">Implementation Note 1</w:t>
+            </w:r>
+            <w:r>
+              <w:rPr>
+                <w:rtl w:val="0"/>
+              </w:rPr>
+              <w:t xml:space="preserve">: Android Room </w:t>
+            </w:r>
+            <w:r>
+              <w:rPr>
+                <w:rFonts w:ascii="Roboto Mono" w:cs="Roboto Mono" w:eastAsia="Roboto Mono" w:hAnsi="Roboto Mono"/>
+                <w:color w:val="188038"/>
+                <w:rtl w:val="0"/>
+              </w:rPr>
+              <w:t xml:space="preserve">OUTBOX_ENTITY</w:t>
+            </w:r>
+            <w:r>
+              <w:rPr>
+                <w:rtl w:val="0"/>
+              </w:rPr>
+              <w:t xml:space="preserve">, NNN retry threshold, device network connectivity check, monotonic sequence numbering (</w:t>
+            </w:r>
+            <w:r>
+              <w:rPr>
+                <w:rFonts w:ascii="Roboto Mono" w:cs="Roboto Mono" w:eastAsia="Roboto Mono" w:hAnsi="Roboto Mono"/>
+                <w:color w:val="188038"/>
+                <w:rtl w:val="0"/>
+              </w:rPr>
+              <w:t xml:space="preserve">MESSAGE.seq</w:t>
+            </w:r>
+            <w:r>
+              <w:rPr>
+                <w:rtl w:val="0"/>
+              </w:rPr>
+              <w:t xml:space="preserve">).</w:t>
+            </w:r>
+          </w:p>
+        </w:tc>
+      </w:tr>
+      <w:tr>
+        <w:trPr>
+          <w:cantSplit w:val="0"/>
+          <w:trHeight w:val="1880" w:hRule="atLeast"/>
+          <w:tblHeader w:val="0"/>
+        </w:trPr>
+        <w:tc>
+          <w:tcPr/>
+          <w:p>
+            <w:pPr>
+              <w:rPr/>
+            </w:pPr>
+            <w:r>
+              <w:rPr>
+                <w:b w:val="1"/>
+                <w:bCs w:val="1"/>
+                <w:rtl w:val="0"/>
+              </w:rPr>
+              <w:t xml:space="preserve">Diagram 4</w:t>
+            </w:r>
+            <w:r>
+              <w:rPr>
+                <w:rtl w:val="0"/>
+              </w:rPr>
+            </w:r>
+          </w:p>
+        </w:tc>
+        <w:tc>
+          <w:tcPr/>
+          <w:p>
+            <w:pPr>
+              <w:rPr/>
+            </w:pPr>
+            <w:r>
+              <w:rPr>
+                <w:b w:val="1"/>
+                <w:bCs w:val="1"/>
+                <w:rtl w:val="0"/>
+              </w:rPr>
+              <w:t xml:space="preserve">Read Receipts &amp; Client-Side "Seen" Status Deduction</w:t>
+            </w:r>
+            <w:r>
+              <w:rPr>
+                <w:rtl w:val="0"/>
+              </w:rPr>
+            </w:r>
+          </w:p>
+        </w:tc>
+        <w:tc>
+          <w:tcPr/>
+          <w:p>
+            <w:pPr>
+              <w:rPr/>
+            </w:pPr>
+            <w:r>
+              <w:rPr>
+                <w:rtl w:val="0"/>
+              </w:rPr>
+              <w:t xml:space="preserve">UC14 / </w:t>
+            </w:r>
+            <w:r>
+              <w:rPr>
+                <w:b w:val="1"/>
+                <w:bCs w:val="1"/>
+                <w:rtl w:val="0"/>
+              </w:rPr>
+              <w:t xml:space="preserve">Seq3</w:t>
+            </w:r>
+            <w:r>
+              <w:rPr>
+                <w:rtl w:val="0"/>
+              </w:rPr>
+            </w:r>
+          </w:p>
+        </w:tc>
+        <w:tc>
+          <w:tcPr/>
+          <w:p>
+            <w:pPr>
+              <w:rPr/>
+            </w:pPr>
+            <w:r>
+              <w:rPr>
+                <w:b w:val="1"/>
+                <w:bCs w:val="1"/>
+                <w:rtl w:val="0"/>
+              </w:rPr>
+              <w:t xml:space="preserve">Implementation Note 2</w:t>
+            </w:r>
+            <w:r>
+              <w:rPr>
+                <w:rtl w:val="0"/>
+              </w:rPr>
+              <w:t xml:space="preserve">: Server </w:t>
+            </w:r>
+            <w:r>
+              <w:rPr>
+                <w:b w:val="1"/>
+                <w:bCs w:val="1"/>
+                <w:rtl w:val="0"/>
+              </w:rPr>
+              <w:t xml:space="preserve">does not</w:t>
+            </w:r>
+            <w:r>
+              <w:rPr>
+                <w:rtl w:val="0"/>
+              </w:rPr>
+              <w:t xml:space="preserve"> store a per-message "seen" status; it only records </w:t>
+            </w:r>
+            <w:r>
+              <w:rPr>
+                <w:rFonts w:ascii="Roboto Mono" w:cs="Roboto Mono" w:eastAsia="Roboto Mono" w:hAnsi="Roboto Mono"/>
+                <w:color w:val="188038"/>
+                <w:rtl w:val="0"/>
+              </w:rPr>
+              <w:t xml:space="preserve">CONVERSATION_MEMBER.lastReadSeq</w:t>
+            </w:r>
+            <w:r>
+              <w:rPr>
+                <w:rtl w:val="0"/>
+              </w:rPr>
+              <w:t xml:space="preserve">. The client UI </w:t>
+            </w:r>
+            <w:r>
+              <w:rPr>
+                <w:b w:val="1"/>
+                <w:bCs w:val="1"/>
+                <w:rtl w:val="0"/>
+              </w:rPr>
+              <w:t xml:space="preserve">deduces</w:t>
+            </w:r>
+            <w:r>
+              <w:rPr>
+                <w:rtl w:val="0"/>
+              </w:rPr>
+              <w:t xml:space="preserve"> the "Seen" state when </w:t>
+            </w:r>
+            <w:r>
+              <w:rPr>
+                <w:rFonts w:ascii="Roboto Mono" w:cs="Roboto Mono" w:eastAsia="Roboto Mono" w:hAnsi="Roboto Mono"/>
+                <w:color w:val="188038"/>
+                <w:rtl w:val="0"/>
+              </w:rPr>
+              <w:t xml:space="preserve">msg.seq &lt;= peerLastReadSeq</w:t>
+            </w:r>
+            <w:r>
+              <w:rPr>
+                <w:rtl w:val="0"/>
+              </w:rPr>
+              <w:t xml:space="preserve">.</w:t>
+            </w:r>
+          </w:p>
+        </w:tc>
+      </w:tr>
+      <w:tr>
+        <w:trPr>
+          <w:cantSplit w:val="0"/>
+          <w:trHeight w:val="1055" w:hRule="atLeast"/>
+          <w:tblHeader w:val="0"/>
+        </w:trPr>
+        <w:tc>
+          <w:tcPr/>
+          <w:p>
+            <w:pPr>
+              <w:rPr/>
+            </w:pPr>
+            <w:r>
+              <w:rPr>
+                <w:b w:val="1"/>
+                <w:bCs w:val="1"/>
+                <w:rtl w:val="0"/>
+              </w:rPr>
+              <w:t xml:space="preserve">Diagram 5</w:t>
+            </w:r>
+            <w:r>
+              <w:rPr>
+                <w:rtl w:val="0"/>
+              </w:rPr>
+            </w:r>
+          </w:p>
+        </w:tc>
+        <w:tc>
+          <w:tcPr/>
+          <w:p>
+            <w:pPr>
+              <w:rPr/>
+            </w:pPr>
+            <w:r>
+              <w:rPr>
+                <w:b w:val="1"/>
+                <w:bCs w:val="1"/>
+                <w:rtl w:val="0"/>
+              </w:rPr>
+              <w:t xml:space="preserve">Media Upload via MinIO Pre-signed URLs</w:t>
+            </w:r>
+            <w:r>
+              <w:rPr>
+                <w:rtl w:val="0"/>
+              </w:rPr>
+            </w:r>
+          </w:p>
+        </w:tc>
+        <w:tc>
+          <w:tcPr/>
+          <w:p>
+            <w:pPr>
+              <w:rPr/>
+            </w:pPr>
+            <w:r>
+              <w:rPr>
+                <w:rtl w:val="0"/>
+              </w:rPr>
+              <w:t xml:space="preserve">UC12 / </w:t>
+            </w:r>
+            <w:r>
+              <w:rPr>
+                <w:b w:val="1"/>
+                <w:bCs w:val="1"/>
+                <w:rtl w:val="0"/>
+              </w:rPr>
+              <w:t xml:space="preserve">Seq4</w:t>
+            </w:r>
+            <w:r>
+              <w:rPr>
+                <w:rtl w:val="0"/>
+              </w:rPr>
+            </w:r>
+          </w:p>
+        </w:tc>
+        <w:tc>
+          <w:tcPr/>
+          <w:p>
+            <w:pPr>
+              <w:rPr/>
+            </w:pPr>
+            <w:r>
+              <w:rPr>
+                <w:rFonts w:ascii="Roboto Mono" w:cs="Roboto Mono" w:eastAsia="Roboto Mono" w:hAnsi="Roboto Mono"/>
+                <w:color w:val="188038"/>
+                <w:rtl w:val="0"/>
+              </w:rPr>
+              <w:t xml:space="preserve">Media.MEDIA</w:t>
+            </w:r>
+            <w:r>
+              <w:rPr>
+                <w:rtl w:val="0"/>
+              </w:rPr>
+              <w:t xml:space="preserve"> (</w:t>
+            </w:r>
+            <w:r>
+              <w:rPr>
+                <w:rFonts w:ascii="Roboto Mono" w:cs="Roboto Mono" w:eastAsia="Roboto Mono" w:hAnsi="Roboto Mono"/>
+                <w:color w:val="188038"/>
+                <w:rtl w:val="0"/>
+              </w:rPr>
+              <w:t xml:space="preserve">status: uploading -&gt; ready</w:t>
+            </w:r>
+            <w:r>
+              <w:rPr>
+                <w:rtl w:val="0"/>
+              </w:rPr>
+              <w:t xml:space="preserve">), MinIO Object Storage, client direct binary upload.</w:t>
+            </w:r>
+          </w:p>
+        </w:tc>
+      </w:tr>
+      <w:tr>
+        <w:trPr>
+          <w:cantSplit w:val="0"/>
+          <w:trHeight w:val="1340" w:hRule="atLeast"/>
+          <w:tblHeader w:val="0"/>
+        </w:trPr>
+        <w:tc>
+          <w:tcPr/>
+          <w:p>
+            <w:pPr>
+              <w:rPr/>
+            </w:pPr>
+            <w:r>
+              <w:rPr>
+                <w:b w:val="1"/>
+                <w:bCs w:val="1"/>
+                <w:rtl w:val="0"/>
+              </w:rPr>
+              <w:t xml:space="preserve">Diagram 6</w:t>
+            </w:r>
+            <w:r>
+              <w:rPr>
+                <w:rtl w:val="0"/>
+              </w:rPr>
+            </w:r>
+          </w:p>
+        </w:tc>
+        <w:tc>
+          <w:tcPr/>
+          <w:p>
+            <w:pPr>
+              <w:rPr/>
+            </w:pPr>
+            <w:r>
+              <w:rPr>
+                <w:b w:val="1"/>
+                <w:bCs w:val="1"/>
+                <w:rtl w:val="0"/>
+              </w:rPr>
+              <w:t xml:space="preserve">Audio/Video Call Signaling (WebRTC Signaling)</w:t>
+            </w:r>
+            <w:r>
+              <w:rPr>
+                <w:rtl w:val="0"/>
+              </w:rPr>
+            </w:r>
+          </w:p>
+        </w:tc>
+        <w:tc>
+          <w:tcPr/>
+          <w:p>
+            <w:pPr>
+              <w:rPr/>
+            </w:pPr>
+            <w:r>
+              <w:rPr>
+                <w:rtl w:val="0"/>
+              </w:rPr>
+              <w:t xml:space="preserve">UC20, UC21, UC22, UC22b / </w:t>
+            </w:r>
+            <w:r>
+              <w:rPr>
+                <w:b w:val="1"/>
+                <w:bCs w:val="1"/>
+                <w:rtl w:val="0"/>
+              </w:rPr>
+              <w:t xml:space="preserve">Seq5</w:t>
+            </w:r>
+            <w:r>
+              <w:rPr>
+                <w:rtl w:val="0"/>
+              </w:rPr>
+            </w:r>
+          </w:p>
+        </w:tc>
+        <w:tc>
+          <w:tcPr/>
+          <w:p>
+            <w:pPr>
+              <w:rPr/>
+            </w:pPr>
+            <w:r>
+              <w:rPr>
+                <w:rtl w:val="0"/>
+              </w:rPr>
+              <w:t xml:space="preserve">Redis </w:t>
+            </w:r>
+            <w:r>
+              <w:rPr>
+                <w:rFonts w:ascii="Roboto Mono" w:cs="Roboto Mono" w:eastAsia="Roboto Mono" w:hAnsi="Roboto Mono"/>
+                <w:color w:val="188038"/>
+                <w:rtl w:val="0"/>
+              </w:rPr>
+              <w:t xml:space="preserve">call:{callId}</w:t>
+            </w:r>
+            <w:r>
+              <w:rPr>
+                <w:rtl w:val="0"/>
+              </w:rPr>
+              <w:t xml:space="preserve"> (60s ringing TTL), FCM High-Priority push, SDP/ICE candidate relay, coturn STUN/TURN fallback, </w:t>
+            </w:r>
+            <w:r>
+              <w:rPr>
+                <w:rFonts w:ascii="Roboto Mono" w:cs="Roboto Mono" w:eastAsia="Roboto Mono" w:hAnsi="Roboto Mono"/>
+                <w:color w:val="188038"/>
+                <w:rtl w:val="0"/>
+              </w:rPr>
+              <w:t xml:space="preserve">Call.CALL_LOG</w:t>
+            </w:r>
+            <w:r>
+              <w:rPr>
+                <w:rtl w:val="0"/>
+              </w:rPr>
+              <w:t xml:space="preserve">.</w:t>
+            </w:r>
+          </w:p>
+        </w:tc>
+      </w:tr>
+      <w:tr>
+        <w:trPr>
+          <w:cantSplit w:val="0"/>
+          <w:trHeight w:val="1340" w:hRule="atLeast"/>
+          <w:tblHeader w:val="0"/>
+        </w:trPr>
+        <w:tc>
+          <w:tcPr/>
+          <w:p>
+            <w:pPr>
+              <w:rPr/>
+            </w:pPr>
+            <w:r>
+              <w:rPr>
+                <w:b w:val="1"/>
+                <w:bCs w:val="1"/>
+                <w:rtl w:val="0"/>
+              </w:rPr>
+              <w:t xml:space="preserve">Diagram 7</w:t>
+            </w:r>
+            <w:r>
+              <w:rPr>
+                <w:rtl w:val="0"/>
+              </w:rPr>
+            </w:r>
+          </w:p>
+        </w:tc>
+        <w:tc>
+          <w:tcPr/>
+          <w:p>
+            <w:pPr>
+              <w:rPr/>
+            </w:pPr>
+            <w:r>
+              <w:rPr>
+                <w:b w:val="1"/>
+                <w:bCs w:val="1"/>
+                <w:rtl w:val="0"/>
+              </w:rPr>
+              <w:t xml:space="preserve">Cursor-based Message Synchronization &amp; Cloud Backup / Restore</w:t>
+            </w:r>
+            <w:r>
+              <w:rPr>
+                <w:rtl w:val="0"/>
+              </w:rPr>
+            </w:r>
+          </w:p>
+        </w:tc>
+        <w:tc>
+          <w:tcPr/>
+          <w:p>
+            <w:pPr>
+              <w:rPr/>
+            </w:pPr>
+            <w:r>
+              <w:rPr>
+                <w:rtl w:val="0"/>
+              </w:rPr>
+              <w:t xml:space="preserve">UC16, UC24, UC25 / </w:t>
+            </w:r>
+            <w:r>
+              <w:rPr>
+                <w:b w:val="1"/>
+                <w:bCs w:val="1"/>
+                <w:rtl w:val="0"/>
+              </w:rPr>
+              <w:t xml:space="preserve">Seq6</w:t>
+            </w:r>
+            <w:r>
+              <w:rPr>
+                <w:rtl w:val="0"/>
+              </w:rPr>
+            </w:r>
+          </w:p>
+        </w:tc>
+        <w:tc>
+          <w:tcPr/>
+          <w:p>
+            <w:pPr>
+              <w:rPr/>
+            </w:pPr>
+            <w:r>
+              <w:rPr>
+                <w:rtl w:val="0"/>
+              </w:rPr>
+              <w:t xml:space="preserve">Room </w:t>
+            </w:r>
+            <w:r>
+              <w:rPr>
+                <w:rFonts w:ascii="Roboto Mono" w:cs="Roboto Mono" w:eastAsia="Roboto Mono" w:hAnsi="Roboto Mono"/>
+                <w:color w:val="188038"/>
+                <w:rtl w:val="0"/>
+              </w:rPr>
+              <w:t xml:space="preserve">SYNC_STATE_ENTITY</w:t>
+            </w:r>
+            <w:r>
+              <w:rPr>
+                <w:rtl w:val="0"/>
+              </w:rPr>
+              <w:t xml:space="preserve">, </w:t>
+            </w:r>
+            <w:r>
+              <w:rPr>
+                <w:rFonts w:ascii="Roboto Mono" w:cs="Roboto Mono" w:eastAsia="Roboto Mono" w:hAnsi="Roboto Mono"/>
+                <w:color w:val="188038"/>
+                <w:rtl w:val="0"/>
+              </w:rPr>
+              <w:t xml:space="preserve">Utility.BACKUP_JOB</w:t>
+            </w:r>
+            <w:r>
+              <w:rPr>
+                <w:rtl w:val="0"/>
+              </w:rPr>
+              <w:t xml:space="preserve">, MinIO encrypted archive, idempotent batch import using </w:t>
+            </w:r>
+            <w:r>
+              <w:rPr>
+                <w:rFonts w:ascii="Roboto Mono" w:cs="Roboto Mono" w:eastAsia="Roboto Mono" w:hAnsi="Roboto Mono"/>
+                <w:color w:val="188038"/>
+                <w:rtl w:val="0"/>
+              </w:rPr>
+              <w:t xml:space="preserve">clientMsgId</w:t>
+            </w:r>
+            <w:r>
+              <w:rPr>
+                <w:rtl w:val="0"/>
+              </w:rPr>
+              <w:t xml:space="preserve">.</w:t>
+            </w:r>
+          </w:p>
+        </w:tc>
+      </w:tr>
+    </w:tbl>
+    <w:p>
+      <w:pPr>
+        <w:rPr/>
+      </w:pPr>
+      <w:r>
+        <w:rPr>
+          <w:rtl w:val="0"/>
+        </w:rPr>
+      </w:r>
+    </w:p>
+    <w:p>
+      <w:pPr>
+        <w:pStyle w:val="Heading2"/>
+        <w:keepNext w:val="0"/>
+        <w:keepLines w:val="0"/>
+        <w:spacing w:after="80" w:lineRule="auto"/>
+        <w:rPr>
+          <w:b w:val="1"/>
+          <w:bCs w:val="1"/>
+          <w:sz w:val="28"/>
+          <w:szCs w:val="28"/>
+        </w:rPr>
+      </w:pPr>
+      <w:bookmarkStart w:colFirst="0" w:colLast="0" w:name="_dqxvmagec0i1" w:id="68"/>
+      <w:bookmarkEnd w:id="68"/>
+      <w:r>
+        <w:rPr>
+          <w:b w:val="1"/>
+          <w:bCs w:val="1"/>
+          <w:sz w:val="28"/>
+          <w:szCs w:val="28"/>
+          <w:rtl w:val="0"/>
+        </w:rPr>
+        <w:t xml:space="preserve">Diagram 1: User Authentication &amp; Device Registration Flow (OTP &amp; JWT)</w:t>
+      </w:r>
+    </w:p>
+    <w:p>
+      <w:pPr>
+        <w:rPr>
+          <w:sz w:val="28"/>
+          <w:szCs w:val="28"/>
+        </w:rPr>
+      </w:pPr>
+      <w:r>
+        <w:rPr>
+          <w:sz w:val="28"/>
+          <w:szCs w:val="28"/>
+        </w:rPr>
+        <w:drawing>
+          <wp:inline distB="114300" distT="114300" distL="114300" distR="114300">
+            <wp:extent cx="5731200" cy="6858000"/>
+            <wp:effectExtent b="0" l="0" r="0" t="0"/>
+            <wp:docPr id="17" name="image12.png"/>
+            <a:graphic>
+              <a:graphicData uri="http://schemas.openxmlformats.org/drawingml/2006/picture">
+                <pic:pic>
+                  <pic:nvPicPr>
+                    <pic:cNvPr id="0" name="image12.png"/>
+                    <pic:cNvPicPr preferRelativeResize="0"/>
+                  </pic:nvPicPr>
+                  <pic:blipFill>
+                    <a:blip r:embed="rId33"/>
+                    <a:srcRect b="0" l="0" r="0" t="0"/>
+                    <a:stretch>
+                      <a:fillRect/>
+                    </a:stretch>
+                  </pic:blipFill>
+                  <pic:spPr>
+                    <a:xfrm>
+                      <a:off x="0" y="0"/>
+                      <a:ext cx="5731200" cy="6858000"/>
+                    </a:xfrm>
+                    <a:prstGeom prst="rect"/>
+                    <a:ln/>
+                  </pic:spPr>
+                </pic:pic>
+              </a:graphicData>
+            </a:graphic>
+          </wp:inline>
+        </w:drawing>
+      </w:r>
+      <w:r>
+        <w:rPr>
+          <w:rtl w:val="0"/>
+        </w:rPr>
+      </w:r>
+    </w:p>
+    <w:p>
+      <w:pPr>
+        <w:pStyle w:val="Heading2"/>
+        <w:keepNext w:val="0"/>
+        <w:keepLines w:val="0"/>
+        <w:spacing w:after="80" w:lineRule="auto"/>
+        <w:rPr>
+          <w:b w:val="1"/>
+          <w:bCs w:val="1"/>
+          <w:sz w:val="28"/>
+          <w:szCs w:val="28"/>
+        </w:rPr>
+      </w:pPr>
+      <w:bookmarkStart w:colFirst="0" w:colLast="0" w:name="_hqdbu4qlk0rd" w:id="69"/>
+      <w:bookmarkEnd w:id="69"/>
+      <w:r>
+        <w:rPr>
+          <w:rtl w:val="0"/>
+        </w:rPr>
+      </w:r>
+    </w:p>
+    <w:p>
+      <w:pPr>
+        <w:pStyle w:val="Heading2"/>
+        <w:keepNext w:val="0"/>
+        <w:keepLines w:val="0"/>
+        <w:spacing w:after="80" w:lineRule="auto"/>
+        <w:rPr>
+          <w:b w:val="1"/>
+          <w:bCs w:val="1"/>
+          <w:sz w:val="28"/>
+          <w:szCs w:val="28"/>
+        </w:rPr>
+      </w:pPr>
+      <w:bookmarkStart w:colFirst="0" w:colLast="0" w:name="_pemj8026sovy" w:id="70"/>
+      <w:bookmarkEnd w:id="70"/>
+      <w:r>
+        <w:rPr>
+          <w:rtl w:val="0"/>
+        </w:rPr>
+      </w:r>
+    </w:p>
+    <w:p>
+      <w:pPr>
+        <w:pStyle w:val="Heading2"/>
+        <w:keepNext w:val="0"/>
+        <w:keepLines w:val="0"/>
+        <w:spacing w:after="80" w:lineRule="auto"/>
+        <w:rPr>
+          <w:b w:val="1"/>
+          <w:bCs w:val="1"/>
+          <w:sz w:val="28"/>
+          <w:szCs w:val="28"/>
+        </w:rPr>
+      </w:pPr>
+      <w:bookmarkStart w:colFirst="0" w:colLast="0" w:name="_kkdz1qf77edo" w:id="71"/>
+      <w:bookmarkEnd w:id="71"/>
+      <w:r>
+        <w:rPr>
+          <w:rtl w:val="0"/>
+        </w:rPr>
+      </w:r>
+    </w:p>
+    <w:p>
+      <w:pPr>
+        <w:pStyle w:val="Heading2"/>
+        <w:keepNext w:val="0"/>
+        <w:keepLines w:val="0"/>
+        <w:spacing w:after="80" w:lineRule="auto"/>
+        <w:rPr>
+          <w:b w:val="1"/>
+          <w:bCs w:val="1"/>
+          <w:sz w:val="28"/>
+          <w:szCs w:val="28"/>
+        </w:rPr>
+      </w:pPr>
+      <w:bookmarkStart w:colFirst="0" w:colLast="0" w:name="_h3c963ffdtc6" w:id="72"/>
+      <w:bookmarkEnd w:id="72"/>
+      <w:r>
+        <w:rPr>
+          <w:rtl w:val="0"/>
+        </w:rPr>
+      </w:r>
+    </w:p>
+    <w:p>
+      <w:pPr>
+        <w:pStyle w:val="Heading2"/>
+        <w:keepNext w:val="0"/>
+        <w:keepLines w:val="0"/>
+        <w:spacing w:after="80" w:lineRule="auto"/>
+        <w:rPr>
+          <w:b w:val="1"/>
+          <w:bCs w:val="1"/>
+          <w:sz w:val="28"/>
+          <w:szCs w:val="28"/>
+        </w:rPr>
+      </w:pPr>
+      <w:bookmarkStart w:colFirst="0" w:colLast="0" w:name="_59p3ltuetm5p" w:id="73"/>
+      <w:bookmarkEnd w:id="73"/>
+      <w:r>
+        <w:rPr>
+          <w:b w:val="1"/>
+          <w:bCs w:val="1"/>
+          <w:sz w:val="28"/>
+          <w:szCs w:val="28"/>
+          <w:rtl w:val="0"/>
+        </w:rPr>
+        <w:t xml:space="preserve">Diagram 2: Contact Discovery &amp; Friendship Management Flow</w:t>
+      </w:r>
+    </w:p>
+    <w:p>
+      <w:pPr>
+        <w:rPr/>
+      </w:pPr>
+      <w:r>
+        <w:rPr/>
+        <w:drawing>
+          <wp:inline distB="114300" distT="114300" distL="114300" distR="114300">
+            <wp:extent cx="5731200" cy="4318000"/>
+            <wp:effectExtent b="0" l="0" r="0" t="0"/>
+            <wp:docPr id="5" name="image22.png"/>
+            <a:graphic>
+              <a:graphicData uri="http://schemas.openxmlformats.org/drawingml/2006/picture">
+                <pic:pic>
+                  <pic:nvPicPr>
+                    <pic:cNvPr id="0" name="image22.png"/>
+                    <pic:cNvPicPr preferRelativeResize="0"/>
+                  </pic:nvPicPr>
+                  <pic:blipFill>
+                    <a:blip r:embed="rId34"/>
+                    <a:srcRect b="0" l="0" r="0" t="0"/>
+                    <a:stretch>
+                      <a:fillRect/>
+                    </a:stretch>
+                  </pic:blipFill>
+                  <pic:spPr>
+                    <a:xfrm>
+                      <a:off x="0" y="0"/>
+                      <a:ext cx="5731200" cy="4318000"/>
+                    </a:xfrm>
+                    <a:prstGeom prst="rect"/>
+                    <a:ln/>
+                  </pic:spPr>
+                </pic:pic>
+              </a:graphicData>
+            </a:graphic>
+          </wp:inline>
+        </w:drawing>
+      </w:r>
+      <w:r>
+        <w:rPr>
+          <w:rtl w:val="0"/>
+        </w:rPr>
+      </w:r>
+    </w:p>
+    <w:p>
+      <w:pPr>
+        <w:rPr>
+          <w:sz w:val="28"/>
+          <w:szCs w:val="28"/>
+        </w:rPr>
+      </w:pPr>
+      <w:r>
+        <w:rPr>
+          <w:rtl w:val="0"/>
+        </w:rPr>
+      </w:r>
+    </w:p>
+    <w:p>
+      <w:pPr>
+        <w:pStyle w:val="Heading2"/>
+        <w:keepNext w:val="0"/>
+        <w:keepLines w:val="0"/>
+        <w:spacing w:after="80" w:lineRule="auto"/>
+        <w:rPr>
+          <w:b w:val="1"/>
+          <w:bCs w:val="1"/>
+          <w:sz w:val="28"/>
+          <w:szCs w:val="28"/>
+        </w:rPr>
+      </w:pPr>
+      <w:bookmarkStart w:colFirst="0" w:colLast="0" w:name="_hq8top2e3mrj" w:id="74"/>
+      <w:bookmarkEnd w:id="74"/>
+      <w:r>
+        <w:rPr>
+          <w:rtl w:val="0"/>
+        </w:rPr>
+      </w:r>
+    </w:p>
+    <w:p>
+      <w:pPr>
+        <w:pStyle w:val="Heading2"/>
+        <w:keepNext w:val="0"/>
+        <w:keepLines w:val="0"/>
+        <w:spacing w:after="80" w:lineRule="auto"/>
+        <w:rPr>
+          <w:b w:val="1"/>
+          <w:bCs w:val="1"/>
+          <w:sz w:val="28"/>
+          <w:szCs w:val="28"/>
+        </w:rPr>
+      </w:pPr>
+      <w:bookmarkStart w:colFirst="0" w:colLast="0" w:name="_yn1mc6bwr8pd" w:id="75"/>
+      <w:bookmarkEnd w:id="75"/>
+      <w:r>
+        <w:rPr>
+          <w:rtl w:val="0"/>
+        </w:rPr>
+      </w:r>
+    </w:p>
+    <w:p>
+      <w:pPr>
+        <w:pStyle w:val="Heading2"/>
+        <w:keepNext w:val="0"/>
+        <w:keepLines w:val="0"/>
+        <w:spacing w:after="80" w:lineRule="auto"/>
+        <w:rPr>
+          <w:b w:val="1"/>
+          <w:bCs w:val="1"/>
+          <w:sz w:val="28"/>
+          <w:szCs w:val="28"/>
+        </w:rPr>
+      </w:pPr>
+      <w:bookmarkStart w:colFirst="0" w:colLast="0" w:name="_mz8aqidnoc9v" w:id="76"/>
+      <w:bookmarkEnd w:id="76"/>
+      <w:r>
+        <w:rPr>
+          <w:rtl w:val="0"/>
+        </w:rPr>
+      </w:r>
+    </w:p>
+    <w:p>
+      <w:pPr>
+        <w:pStyle w:val="Heading2"/>
+        <w:keepNext w:val="0"/>
+        <w:keepLines w:val="0"/>
+        <w:spacing w:after="80" w:lineRule="auto"/>
+        <w:rPr>
+          <w:b w:val="1"/>
+          <w:bCs w:val="1"/>
+          <w:sz w:val="28"/>
+          <w:szCs w:val="28"/>
+        </w:rPr>
+      </w:pPr>
+      <w:bookmarkStart w:colFirst="0" w:colLast="0" w:name="_596mkcu6jxu8" w:id="77"/>
+      <w:bookmarkEnd w:id="77"/>
+      <w:r>
+        <w:rPr>
+          <w:rtl w:val="0"/>
+        </w:rPr>
+      </w:r>
+    </w:p>
+    <w:p>
+      <w:pPr>
+        <w:pStyle w:val="Heading2"/>
+        <w:keepNext w:val="0"/>
+        <w:keepLines w:val="0"/>
+        <w:spacing w:after="80" w:lineRule="auto"/>
+        <w:rPr>
+          <w:b w:val="1"/>
+          <w:bCs w:val="1"/>
+          <w:sz w:val="28"/>
+          <w:szCs w:val="28"/>
+        </w:rPr>
+      </w:pPr>
+      <w:bookmarkStart w:colFirst="0" w:colLast="0" w:name="_m7wyoctah4yg" w:id="78"/>
+      <w:bookmarkEnd w:id="78"/>
+      <w:r>
+        <w:rPr>
+          <w:rtl w:val="0"/>
+        </w:rPr>
+      </w:r>
+    </w:p>
+    <w:p>
+      <w:pPr>
+        <w:pStyle w:val="Heading2"/>
+        <w:keepNext w:val="0"/>
+        <w:keepLines w:val="0"/>
+        <w:spacing w:after="80" w:lineRule="auto"/>
+        <w:rPr>
+          <w:b w:val="1"/>
+          <w:bCs w:val="1"/>
+          <w:sz w:val="28"/>
+          <w:szCs w:val="28"/>
+        </w:rPr>
+      </w:pPr>
+      <w:bookmarkStart w:colFirst="0" w:colLast="0" w:name="_b9tqcgldu3ue" w:id="79"/>
+      <w:bookmarkEnd w:id="79"/>
+      <w:r>
+        <w:rPr>
+          <w:rtl w:val="0"/>
+        </w:rPr>
+      </w:r>
+    </w:p>
+    <w:p>
+      <w:pPr>
+        <w:pStyle w:val="Heading2"/>
+        <w:keepNext w:val="0"/>
+        <w:keepLines w:val="0"/>
+        <w:spacing w:after="80" w:lineRule="auto"/>
+        <w:rPr>
+          <w:b w:val="1"/>
+          <w:bCs w:val="1"/>
+          <w:sz w:val="28"/>
+          <w:szCs w:val="28"/>
+        </w:rPr>
+      </w:pPr>
+      <w:bookmarkStart w:colFirst="0" w:colLast="0" w:name="_uc9vfwaej9la" w:id="80"/>
+      <w:bookmarkEnd w:id="80"/>
+      <w:r>
+        <w:rPr>
+          <w:rtl w:val="0"/>
+        </w:rPr>
+      </w:r>
+    </w:p>
+    <w:p>
+      <w:pPr>
+        <w:pStyle w:val="Heading2"/>
+        <w:keepNext w:val="0"/>
+        <w:keepLines w:val="0"/>
+        <w:spacing w:after="80" w:lineRule="auto"/>
+        <w:rPr>
+          <w:b w:val="1"/>
+          <w:bCs w:val="1"/>
+          <w:sz w:val="28"/>
+          <w:szCs w:val="28"/>
+        </w:rPr>
+      </w:pPr>
+      <w:bookmarkStart w:colFirst="0" w:colLast="0" w:name="_xcat83nfx23y" w:id="81"/>
+      <w:bookmarkEnd w:id="81"/>
+      <w:r>
+        <w:rPr>
+          <w:rtl w:val="0"/>
+        </w:rPr>
+      </w:r>
+    </w:p>
+    <w:p>
+      <w:pPr>
+        <w:pStyle w:val="Heading2"/>
+        <w:keepNext w:val="0"/>
+        <w:keepLines w:val="0"/>
+        <w:spacing w:after="80" w:lineRule="auto"/>
+        <w:rPr>
+          <w:b w:val="1"/>
+          <w:bCs w:val="1"/>
+          <w:sz w:val="28"/>
+          <w:szCs w:val="28"/>
+        </w:rPr>
+      </w:pPr>
+      <w:bookmarkStart w:colFirst="0" w:colLast="0" w:name="_26jth8u5o82b" w:id="82"/>
+      <w:bookmarkEnd w:id="82"/>
+      <w:r>
+        <w:rPr>
+          <w:b w:val="1"/>
+          <w:bCs w:val="1"/>
+          <w:sz w:val="28"/>
+          <w:szCs w:val="28"/>
+          <w:rtl w:val="0"/>
+        </w:rPr>
+        <w:t xml:space="preserve">Diagram 3: Core 1-1 Messaging &amp; Room Outbox Dispatch Workflow</w:t>
+      </w:r>
+    </w:p>
+    <w:p>
+      <w:pPr>
+        <w:rPr>
+          <w:sz w:val="28"/>
+          <w:szCs w:val="28"/>
+        </w:rPr>
+      </w:pPr>
+      <w:r>
+        <w:rPr>
+          <w:sz w:val="28"/>
+          <w:szCs w:val="28"/>
+        </w:rPr>
+        <w:drawing>
+          <wp:inline distB="114300" distT="114300" distL="114300" distR="114300">
+            <wp:extent cx="5731200" cy="3886200"/>
+            <wp:effectExtent b="0" l="0" r="0" t="0"/>
+            <wp:docPr id="4" name="image24.png"/>
+            <a:graphic>
+              <a:graphicData uri="http://schemas.openxmlformats.org/drawingml/2006/picture">
+                <pic:pic>
+                  <pic:nvPicPr>
+                    <pic:cNvPr id="0" name="image24.png"/>
+                    <pic:cNvPicPr preferRelativeResize="0"/>
+                  </pic:nvPicPr>
+                  <pic:blipFill>
+                    <a:blip r:embed="rId35"/>
+                    <a:srcRect b="0" l="0" r="0" t="0"/>
+                    <a:stretch>
+                      <a:fillRect/>
+                    </a:stretch>
+                  </pic:blipFill>
+                  <pic:spPr>
+                    <a:xfrm>
+                      <a:off x="0" y="0"/>
+                      <a:ext cx="5731200" cy="3886200"/>
+                    </a:xfrm>
+                    <a:prstGeom prst="rect"/>
+                    <a:ln/>
+                  </pic:spPr>
+                </pic:pic>
+              </a:graphicData>
+            </a:graphic>
+          </wp:inline>
+        </w:drawing>
+      </w:r>
+      <w:r>
+        <w:rPr>
+          <w:rtl w:val="0"/>
+        </w:rPr>
+      </w:r>
+    </w:p>
+    <w:p>
+      <w:pPr>
+        <w:pStyle w:val="Heading2"/>
+        <w:keepNext w:val="0"/>
+        <w:keepLines w:val="0"/>
+        <w:spacing w:after="80" w:lineRule="auto"/>
+        <w:rPr>
+          <w:b w:val="1"/>
+          <w:bCs w:val="1"/>
+          <w:sz w:val="28"/>
+          <w:szCs w:val="28"/>
+        </w:rPr>
+      </w:pPr>
+      <w:bookmarkStart w:colFirst="0" w:colLast="0" w:name="_htx9ygopah6q" w:id="83"/>
+      <w:bookmarkEnd w:id="83"/>
+      <w:r>
+        <w:rPr>
+          <w:rtl w:val="0"/>
+        </w:rPr>
+      </w:r>
+    </w:p>
+    <w:p>
+      <w:pPr>
+        <w:pStyle w:val="Heading2"/>
+        <w:keepNext w:val="0"/>
+        <w:keepLines w:val="0"/>
+        <w:spacing w:after="80" w:lineRule="auto"/>
+        <w:rPr>
+          <w:b w:val="1"/>
+          <w:bCs w:val="1"/>
+          <w:sz w:val="28"/>
+          <w:szCs w:val="28"/>
+        </w:rPr>
+      </w:pPr>
+      <w:bookmarkStart w:colFirst="0" w:colLast="0" w:name="_yhba6xxbz7sj" w:id="84"/>
+      <w:bookmarkEnd w:id="84"/>
+      <w:r>
+        <w:rPr>
+          <w:rtl w:val="0"/>
+        </w:rPr>
+      </w:r>
+    </w:p>
+    <w:p>
+      <w:pPr>
+        <w:pStyle w:val="Heading2"/>
+        <w:keepNext w:val="0"/>
+        <w:keepLines w:val="0"/>
+        <w:spacing w:after="80" w:lineRule="auto"/>
+        <w:rPr>
+          <w:b w:val="1"/>
+          <w:bCs w:val="1"/>
+          <w:sz w:val="28"/>
+          <w:szCs w:val="28"/>
+        </w:rPr>
+      </w:pPr>
+      <w:bookmarkStart w:colFirst="0" w:colLast="0" w:name="_a17t2xob7r84" w:id="85"/>
+      <w:bookmarkEnd w:id="85"/>
+      <w:r>
+        <w:rPr>
+          <w:rtl w:val="0"/>
+        </w:rPr>
+      </w:r>
+    </w:p>
+    <w:p>
+      <w:pPr>
+        <w:pStyle w:val="Heading2"/>
+        <w:keepNext w:val="0"/>
+        <w:keepLines w:val="0"/>
+        <w:spacing w:after="80" w:lineRule="auto"/>
+        <w:rPr>
+          <w:b w:val="1"/>
+          <w:bCs w:val="1"/>
+          <w:sz w:val="28"/>
+          <w:szCs w:val="28"/>
+        </w:rPr>
+      </w:pPr>
+      <w:bookmarkStart w:colFirst="0" w:colLast="0" w:name="_o25h30di1wzk" w:id="86"/>
+      <w:bookmarkEnd w:id="86"/>
+      <w:r>
+        <w:rPr>
+          <w:rtl w:val="0"/>
+        </w:rPr>
+      </w:r>
+    </w:p>
+    <w:p>
+      <w:pPr>
+        <w:pStyle w:val="Heading2"/>
+        <w:keepNext w:val="0"/>
+        <w:keepLines w:val="0"/>
+        <w:spacing w:after="80" w:lineRule="auto"/>
+        <w:rPr>
+          <w:b w:val="1"/>
+          <w:bCs w:val="1"/>
+          <w:sz w:val="28"/>
+          <w:szCs w:val="28"/>
+        </w:rPr>
+      </w:pPr>
+      <w:bookmarkStart w:colFirst="0" w:colLast="0" w:name="_76aycspmhnay" w:id="87"/>
+      <w:bookmarkEnd w:id="87"/>
+      <w:r>
+        <w:rPr>
+          <w:rtl w:val="0"/>
+        </w:rPr>
+      </w:r>
+    </w:p>
+    <w:p>
+      <w:pPr>
+        <w:pStyle w:val="Heading2"/>
+        <w:keepNext w:val="0"/>
+        <w:keepLines w:val="0"/>
+        <w:spacing w:after="80" w:lineRule="auto"/>
+        <w:rPr>
+          <w:b w:val="1"/>
+          <w:bCs w:val="1"/>
+          <w:sz w:val="28"/>
+          <w:szCs w:val="28"/>
+        </w:rPr>
+      </w:pPr>
+      <w:bookmarkStart w:colFirst="0" w:colLast="0" w:name="_5ffbj0ypyafj" w:id="88"/>
+      <w:bookmarkEnd w:id="88"/>
+      <w:r>
+        <w:rPr>
+          <w:rtl w:val="0"/>
+        </w:rPr>
+      </w:r>
+    </w:p>
+    <w:p>
+      <w:pPr>
+        <w:pStyle w:val="Heading2"/>
+        <w:keepNext w:val="0"/>
+        <w:keepLines w:val="0"/>
+        <w:spacing w:after="80" w:lineRule="auto"/>
+        <w:rPr>
+          <w:b w:val="1"/>
+          <w:bCs w:val="1"/>
+          <w:sz w:val="28"/>
+          <w:szCs w:val="28"/>
+        </w:rPr>
+      </w:pPr>
+      <w:bookmarkStart w:colFirst="0" w:colLast="0" w:name="_kqvsiiyrkugk" w:id="89"/>
+      <w:bookmarkEnd w:id="89"/>
+      <w:r>
+        <w:rPr>
+          <w:rtl w:val="0"/>
+        </w:rPr>
+      </w:r>
+    </w:p>
+    <w:p>
+      <w:pPr>
+        <w:pStyle w:val="Heading2"/>
+        <w:keepNext w:val="0"/>
+        <w:keepLines w:val="0"/>
+        <w:spacing w:after="80" w:lineRule="auto"/>
+        <w:rPr>
+          <w:b w:val="1"/>
+          <w:bCs w:val="1"/>
+          <w:sz w:val="28"/>
+          <w:szCs w:val="28"/>
+        </w:rPr>
+      </w:pPr>
+      <w:bookmarkStart w:colFirst="0" w:colLast="0" w:name="_w927qqgg8zzv" w:id="90"/>
+      <w:bookmarkEnd w:id="90"/>
+      <w:r>
+        <w:rPr>
+          <w:rtl w:val="0"/>
+        </w:rPr>
+      </w:r>
+    </w:p>
+    <w:p>
+      <w:pPr>
+        <w:pStyle w:val="Heading2"/>
+        <w:keepNext w:val="0"/>
+        <w:keepLines w:val="0"/>
+        <w:spacing w:after="80" w:lineRule="auto"/>
+        <w:rPr>
+          <w:b w:val="1"/>
+          <w:bCs w:val="1"/>
+          <w:sz w:val="28"/>
+          <w:szCs w:val="28"/>
+        </w:rPr>
+      </w:pPr>
+      <w:bookmarkStart w:colFirst="0" w:colLast="0" w:name="_x3t1x35qcb14" w:id="91"/>
+      <w:bookmarkEnd w:id="91"/>
+      <w:r>
+        <w:rPr>
+          <w:rtl w:val="0"/>
+        </w:rPr>
+      </w:r>
+    </w:p>
+    <w:p>
+      <w:pPr>
+        <w:pStyle w:val="Heading2"/>
+        <w:keepNext w:val="0"/>
+        <w:keepLines w:val="0"/>
+        <w:spacing w:after="80" w:lineRule="auto"/>
+        <w:rPr>
+          <w:b w:val="1"/>
+          <w:bCs w:val="1"/>
+          <w:sz w:val="28"/>
+          <w:szCs w:val="28"/>
+        </w:rPr>
+      </w:pPr>
+      <w:bookmarkStart w:colFirst="0" w:colLast="0" w:name="_w4x1cg3mmeik" w:id="92"/>
+      <w:bookmarkEnd w:id="92"/>
+      <w:r>
+        <w:rPr>
+          <w:b w:val="1"/>
+          <w:bCs w:val="1"/>
+          <w:sz w:val="28"/>
+          <w:szCs w:val="28"/>
+          <w:rtl w:val="0"/>
+        </w:rPr>
+        <w:t xml:space="preserve">Diagram 4: Message Read Receipts &amp; Client-Side "Seen" Status Deduction</w:t>
+      </w:r>
+    </w:p>
+    <w:p>
+      <w:pPr>
+        <w:rPr>
+          <w:sz w:val="28"/>
+          <w:szCs w:val="28"/>
+        </w:rPr>
+      </w:pPr>
+      <w:r>
+        <w:rPr>
+          <w:sz w:val="28"/>
+          <w:szCs w:val="28"/>
+        </w:rPr>
+        <w:drawing>
+          <wp:inline distB="114300" distT="114300" distL="114300" distR="114300">
+            <wp:extent cx="4110038" cy="8121983"/>
+            <wp:effectExtent b="0" l="0" r="0" t="0"/>
+            <wp:docPr id="12" name="image9.png"/>
+            <a:graphic>
+              <a:graphicData uri="http://schemas.openxmlformats.org/drawingml/2006/picture">
+                <pic:pic>
+                  <pic:nvPicPr>
+                    <pic:cNvPr id="0" name="image9.png"/>
+                    <pic:cNvPicPr preferRelativeResize="0"/>
+                  </pic:nvPicPr>
+                  <pic:blipFill>
+                    <a:blip r:embed="rId36"/>
+                    <a:srcRect b="0" l="0" r="0" t="0"/>
+                    <a:stretch>
+                      <a:fillRect/>
+                    </a:stretch>
+                  </pic:blipFill>
+                  <pic:spPr>
+                    <a:xfrm>
+                      <a:off x="0" y="0"/>
+                      <a:ext cx="4110038" cy="8121983"/>
+                    </a:xfrm>
+                    <a:prstGeom prst="rect"/>
+                    <a:ln/>
+                  </pic:spPr>
+                </pic:pic>
+              </a:graphicData>
+            </a:graphic>
+          </wp:inline>
+        </w:drawing>
+      </w:r>
+      <w:r>
+        <w:rPr>
+          <w:rtl w:val="0"/>
+        </w:rPr>
+      </w:r>
+    </w:p>
+    <w:p>
+      <w:pPr>
+        <w:pStyle w:val="Heading2"/>
+        <w:keepNext w:val="0"/>
+        <w:keepLines w:val="0"/>
+        <w:spacing w:after="80" w:lineRule="auto"/>
+        <w:rPr>
+          <w:b w:val="1"/>
+          <w:bCs w:val="1"/>
+          <w:sz w:val="28"/>
+          <w:szCs w:val="28"/>
+        </w:rPr>
+      </w:pPr>
+      <w:bookmarkStart w:colFirst="0" w:colLast="0" w:name="_qujuiweyfxaf" w:id="93"/>
+      <w:bookmarkEnd w:id="93"/>
+      <w:r>
+        <w:rPr>
+          <w:b w:val="1"/>
+          <w:bCs w:val="1"/>
+          <w:sz w:val="28"/>
+          <w:szCs w:val="28"/>
+          <w:rtl w:val="0"/>
+        </w:rPr>
+        <w:t xml:space="preserve">Diagram 5: Media Upload via MinIO Pre-signed URLs Flow</w:t>
+      </w:r>
+    </w:p>
+    <w:p>
+      <w:pPr>
+        <w:rPr>
+          <w:sz w:val="28"/>
+          <w:szCs w:val="28"/>
+        </w:rPr>
+      </w:pPr>
+      <w:r>
+        <w:rPr>
+          <w:sz w:val="28"/>
+          <w:szCs w:val="28"/>
+        </w:rPr>
+        <w:drawing>
+          <wp:inline distB="114300" distT="114300" distL="114300" distR="114300">
+            <wp:extent cx="5731200" cy="6654800"/>
+            <wp:effectExtent b="0" l="0" r="0" t="0"/>
+            <wp:docPr id="10" name="image19.png"/>
+            <a:graphic>
+              <a:graphicData uri="http://schemas.openxmlformats.org/drawingml/2006/picture">
+                <pic:pic>
+                  <pic:nvPicPr>
+                    <pic:cNvPr id="0" name="image19.png"/>
+                    <pic:cNvPicPr preferRelativeResize="0"/>
+                  </pic:nvPicPr>
+                  <pic:blipFill>
+                    <a:blip r:embed="rId37"/>
+                    <a:srcRect b="0" l="0" r="0" t="0"/>
+                    <a:stretch>
+                      <a:fillRect/>
+                    </a:stretch>
+                  </pic:blipFill>
+                  <pic:spPr>
+                    <a:xfrm>
+                      <a:off x="0" y="0"/>
+                      <a:ext cx="5731200" cy="6654800"/>
+                    </a:xfrm>
+                    <a:prstGeom prst="rect"/>
+                    <a:ln/>
+                  </pic:spPr>
+                </pic:pic>
+              </a:graphicData>
+            </a:graphic>
+          </wp:inline>
+        </w:drawing>
+      </w:r>
+      <w:r>
+        <w:rPr>
+          <w:rtl w:val="0"/>
+        </w:rPr>
+      </w:r>
+    </w:p>
+    <w:p>
+      <w:pPr>
+        <w:rPr>
+          <w:sz w:val="28"/>
+          <w:szCs w:val="28"/>
+        </w:rPr>
+      </w:pPr>
+      <w:r>
+        <w:rPr>
+          <w:rtl w:val="0"/>
+        </w:rPr>
+      </w:r>
+    </w:p>
+    <w:p>
+      <w:pPr>
+        <w:rPr>
+          <w:sz w:val="28"/>
+          <w:szCs w:val="28"/>
+        </w:rPr>
+      </w:pPr>
+      <w:r>
+        <w:rPr>
+          <w:rtl w:val="0"/>
+        </w:rPr>
+      </w:r>
+    </w:p>
+    <w:p>
+      <w:pPr>
+        <w:rPr>
+          <w:sz w:val="28"/>
+          <w:szCs w:val="28"/>
+        </w:rPr>
+      </w:pPr>
+      <w:r>
+        <w:rPr>
+          <w:rtl w:val="0"/>
+        </w:rPr>
+      </w:r>
+    </w:p>
+    <w:p>
+      <w:pPr>
+        <w:rPr>
+          <w:sz w:val="28"/>
+          <w:szCs w:val="28"/>
+        </w:rPr>
+      </w:pPr>
+      <w:r>
+        <w:rPr>
+          <w:rtl w:val="0"/>
+        </w:rPr>
+      </w:r>
+    </w:p>
+    <w:p>
+      <w:pPr>
+        <w:rPr>
+          <w:sz w:val="28"/>
+          <w:szCs w:val="28"/>
+        </w:rPr>
+      </w:pPr>
+      <w:r>
+        <w:rPr>
+          <w:rtl w:val="0"/>
+        </w:rPr>
+      </w:r>
+    </w:p>
+    <w:p>
+      <w:pPr>
+        <w:rPr>
+          <w:sz w:val="28"/>
+          <w:szCs w:val="28"/>
+        </w:rPr>
+      </w:pPr>
+      <w:r>
+        <w:rPr>
+          <w:rtl w:val="0"/>
+        </w:rPr>
+      </w:r>
+    </w:p>
+    <w:p>
+      <w:pPr>
+        <w:pStyle w:val="Heading2"/>
+        <w:keepNext w:val="0"/>
+        <w:keepLines w:val="0"/>
+        <w:spacing w:after="80" w:lineRule="auto"/>
+        <w:rPr>
+          <w:b w:val="1"/>
+          <w:bCs w:val="1"/>
+          <w:sz w:val="28"/>
+          <w:szCs w:val="28"/>
+        </w:rPr>
+      </w:pPr>
+      <w:bookmarkStart w:colFirst="0" w:colLast="0" w:name="_xk2or3izcf5s" w:id="94"/>
+      <w:bookmarkEnd w:id="94"/>
+      <w:r>
+        <w:rPr>
+          <w:b w:val="1"/>
+          <w:bCs w:val="1"/>
+          <w:sz w:val="28"/>
+          <w:szCs w:val="28"/>
+          <w:rtl w:val="0"/>
+        </w:rPr>
+        <w:t xml:space="preserve">Diagram 6: WebRTC Audio/Video Call Signaling Flow</w:t>
+      </w:r>
+    </w:p>
+    <w:p>
+      <w:pPr>
+        <w:rPr>
+          <w:sz w:val="28"/>
+          <w:szCs w:val="28"/>
+        </w:rPr>
+      </w:pPr>
+      <w:r>
+        <w:rPr>
+          <w:sz w:val="28"/>
+          <w:szCs w:val="28"/>
+        </w:rPr>
+        <w:drawing>
+          <wp:inline distB="114300" distT="114300" distL="114300" distR="114300">
+            <wp:extent cx="5731200" cy="5778500"/>
+            <wp:effectExtent b="0" l="0" r="0" t="0"/>
+            <wp:docPr id="23" name="image18.png"/>
+            <a:graphic>
+              <a:graphicData uri="http://schemas.openxmlformats.org/drawingml/2006/picture">
+                <pic:pic>
+                  <pic:nvPicPr>
+                    <pic:cNvPr id="0" name="image18.png"/>
+                    <pic:cNvPicPr preferRelativeResize="0"/>
+                  </pic:nvPicPr>
+                  <pic:blipFill>
+                    <a:blip r:embed="rId38"/>
+                    <a:srcRect b="0" l="0" r="0" t="0"/>
+                    <a:stretch>
+                      <a:fillRect/>
+                    </a:stretch>
+                  </pic:blipFill>
+                  <pic:spPr>
+                    <a:xfrm>
+                      <a:off x="0" y="0"/>
+                      <a:ext cx="5731200" cy="5778500"/>
+                    </a:xfrm>
+                    <a:prstGeom prst="rect"/>
+                    <a:ln/>
+                  </pic:spPr>
+                </pic:pic>
+              </a:graphicData>
+            </a:graphic>
+          </wp:inline>
+        </w:drawing>
+      </w:r>
+      <w:r>
+        <w:rPr>
+          <w:rtl w:val="0"/>
+        </w:rPr>
+      </w:r>
+    </w:p>
+    <w:p>
+      <w:pPr>
+        <w:rPr>
+          <w:sz w:val="28"/>
+          <w:szCs w:val="28"/>
+        </w:rPr>
+      </w:pPr>
+      <w:r>
+        <w:rPr>
+          <w:rtl w:val="0"/>
+        </w:rPr>
+      </w:r>
+    </w:p>
+    <w:p>
+      <w:pPr>
+        <w:rPr>
+          <w:sz w:val="28"/>
+          <w:szCs w:val="28"/>
+        </w:rPr>
+      </w:pPr>
+      <w:r>
+        <w:rPr>
+          <w:rtl w:val="0"/>
+        </w:rPr>
+      </w:r>
+    </w:p>
+    <w:p>
+      <w:pPr>
+        <w:rPr>
+          <w:sz w:val="28"/>
+          <w:szCs w:val="28"/>
+        </w:rPr>
+      </w:pPr>
+      <w:r>
+        <w:rPr>
+          <w:rtl w:val="0"/>
+        </w:rPr>
+      </w:r>
+    </w:p>
+    <w:p>
+      <w:pPr>
+        <w:rPr>
+          <w:sz w:val="28"/>
+          <w:szCs w:val="28"/>
+        </w:rPr>
+      </w:pPr>
+      <w:r>
+        <w:rPr>
+          <w:rtl w:val="0"/>
+        </w:rPr>
+      </w:r>
+    </w:p>
+    <w:p>
+      <w:pPr>
+        <w:rPr>
+          <w:sz w:val="28"/>
+          <w:szCs w:val="28"/>
+        </w:rPr>
+      </w:pPr>
+      <w:r>
+        <w:rPr>
+          <w:rtl w:val="0"/>
+        </w:rPr>
+      </w:r>
+    </w:p>
+    <w:p>
+      <w:pPr>
+        <w:rPr>
+          <w:sz w:val="28"/>
+          <w:szCs w:val="28"/>
+        </w:rPr>
+      </w:pPr>
+      <w:r>
+        <w:rPr>
+          <w:sz w:val="28"/>
+          <w:szCs w:val="28"/>
+          <w:rtl w:val="0"/>
+        </w:rPr>
+        <w:br w:type="textWrapping"/>
+      </w:r>
+    </w:p>
+    <w:p>
+      <w:pPr>
+        <w:rPr>
+          <w:sz w:val="28"/>
+          <w:szCs w:val="28"/>
+        </w:rPr>
+      </w:pPr>
+      <w:r>
+        <w:rPr>
+          <w:rtl w:val="0"/>
+        </w:rPr>
+      </w:r>
+    </w:p>
+    <w:p>
+      <w:pPr>
+        <w:rPr>
+          <w:sz w:val="28"/>
+          <w:szCs w:val="28"/>
+        </w:rPr>
+      </w:pPr>
+      <w:r>
+        <w:rPr>
+          <w:rtl w:val="0"/>
+        </w:rPr>
+      </w:r>
+    </w:p>
+    <w:p>
+      <w:pPr>
+        <w:pStyle w:val="Heading2"/>
+        <w:keepNext w:val="0"/>
+        <w:keepLines w:val="0"/>
+        <w:spacing w:after="80" w:lineRule="auto"/>
+        <w:rPr>
+          <w:b w:val="1"/>
+          <w:bCs w:val="1"/>
+          <w:sz w:val="28"/>
+          <w:szCs w:val="28"/>
+        </w:rPr>
+      </w:pPr>
+      <w:bookmarkStart w:colFirst="0" w:colLast="0" w:name="_vr77hr9g4ipn" w:id="95"/>
+      <w:bookmarkEnd w:id="95"/>
+      <w:r>
+        <w:rPr>
+          <w:b w:val="1"/>
+          <w:bCs w:val="1"/>
+          <w:sz w:val="28"/>
+          <w:szCs w:val="28"/>
+          <w:rtl w:val="0"/>
+        </w:rPr>
+        <w:t xml:space="preserve">Diagram 7: Cursor-based Message Sync &amp; Cloud Backup / Restore Workflow</w:t>
+      </w:r>
+    </w:p>
+    <w:p>
+      <w:pPr>
+        <w:rPr/>
+      </w:pPr>
+      <w:r>
+        <w:rPr/>
+        <w:drawing>
+          <wp:inline distB="114300" distT="114300" distL="114300" distR="114300">
+            <wp:extent cx="5731200" cy="3416300"/>
+            <wp:effectExtent b="0" l="0" r="0" t="0"/>
+            <wp:docPr id="14" name="image15.png"/>
+            <a:graphic>
+              <a:graphicData uri="http://schemas.openxmlformats.org/drawingml/2006/picture">
+                <pic:pic>
+                  <pic:nvPicPr>
+                    <pic:cNvPr id="0" name="image15.png"/>
+                    <pic:cNvPicPr preferRelativeResize="0"/>
+                  </pic:nvPicPr>
+                  <pic:blipFill>
+                    <a:blip r:embed="rId39"/>
+                    <a:srcRect b="0" l="0" r="0" t="0"/>
+                    <a:stretch>
+                      <a:fillRect/>
+                    </a:stretch>
+                  </pic:blipFill>
+                  <pic:spPr>
+                    <a:xfrm>
+                      <a:off x="0" y="0"/>
+                      <a:ext cx="5731200" cy="3416300"/>
+                    </a:xfrm>
+                    <a:prstGeom prst="rect"/>
+                    <a:ln/>
+                  </pic:spPr>
+                </pic:pic>
+              </a:graphicData>
+            </a:graphic>
+          </wp:inline>
+        </w:drawing>
+      </w:r>
+      <w:r>
+        <w:rPr>
+          <w:rtl w:val="0"/>
+        </w:rPr>
+      </w:r>
+    </w:p>
+    <w:p>
+      <w:pPr>
         <w:rPr/>
         <w:sectPr>
-          <w:headerReference r:id="rId33" w:type="default"/>
-          <w:footerReference r:id="rId34" w:type="default"/>
+          <w:headerReference r:id="rId40" w:type="default"/>
+          <w:footerReference r:id="rId41" w:type="default"/>
           <w:type w:val="nextPage"/>
           <w:pgSz w:h="16834" w:w="11909" w:orient="portrait"/>
           <w:pgMar w:bottom="1440" w:top="1440" w:left="1440" w:right="1440" w:header="720" w:footer="720"/>
@@ -38505,16 +40763,16 @@
           <wp:inline distB="114300" distT="114300" distL="114300" distR="114300">
             <wp:extent cx="6138863" cy="4410075"/>
             <wp:effectExtent b="0" l="0" r="0" t="0"/>
-            <wp:docPr id="15" name="image10.png"/>
+            <wp:docPr id="6" name="image21.png"/>
             <a:graphic>
               <a:graphicData uri="http://schemas.openxmlformats.org/drawingml/2006/picture">
                 <pic:pic>
                   <pic:nvPicPr>
-                    <pic:cNvPr id="0" name="image10.png"/>
+                    <pic:cNvPr id="0" name="image21.png"/>
                     <pic:cNvPicPr preferRelativeResize="0"/>
                   </pic:nvPicPr>
                   <pic:blipFill>
-                    <a:blip r:embed="rId35"/>
+                    <a:blip r:embed="rId42"/>
                     <a:srcRect b="0" l="0" r="0" t="0"/>
                     <a:stretch>
                       <a:fillRect/>
@@ -38541,8 +40799,8 @@
       </w:r>
     </w:p>
     <w:sectPr>
-      <w:headerReference r:id="rId36" w:type="default"/>
-      <w:footerReference r:id="rId37" w:type="default"/>
+      <w:headerReference r:id="rId43" w:type="default"/>
+      <w:footerReference r:id="rId44" w:type="default"/>
       <w:type w:val="nextPage"/>
       <w:pgSz w:h="16834" w:w="11909" w:orient="portrait"/>
       <w:pgMar w:bottom="1440" w:top="1440" w:left="1440" w:right="1440" w:header="720" w:footer="720"/>
@@ -41212,6 +43470,13 @@
       <w:tblCellMar/>
     </w:tblPr>
   </w:style>
+  <w:style w:type="table" w:styleId="Table21">
+    <w:basedOn w:val="TableNormal"/>
+    <w:tblPr>
+      <w:tblStyleRowBandSize w:val="1"/>
+      <w:tblStyleColBandSize w:val="1"/>
+    </w:tblPr>
+  </w:style>
 </w:styles>
 </file>
 

</xml_diff>